<commit_message>
Refine profile typography and remove resume footer
</commit_message>
<xml_diff>
--- a/resume/dave-bettner-design-engineering.docx
+++ b/resume/dave-bettner-design-engineering.docx
@@ -2,7 +2,7 @@
 <file path=word/document.xml><?xml version="1.0" encoding="utf-8"?>
 <w:document xmlns:w="http://schemas.openxmlformats.org/wordprocessingml/2006/main" xmlns:m="http://schemas.openxmlformats.org/officeDocument/2006/math" xmlns:r="http://schemas.openxmlformats.org/officeDocument/2006/relationships" xmlns:o="urn:schemas-microsoft-com:office:office" xmlns:v="urn:schemas-microsoft-com:vml" xmlns:w10="urn:schemas-microsoft-com:office:word" xmlns:a="http://schemas.openxmlformats.org/drawingml/2006/main" xmlns:pic="http://schemas.openxmlformats.org/drawingml/2006/picture" xmlns:wp="http://schemas.openxmlformats.org/drawingml/2006/wordprocessingDrawing">
   <w:body>
-    <w:bookmarkStart w:id="42" w:name="dave-bettner"/>
+    <w:bookmarkStart w:id="41" w:name="dave-bettner"/>
     <w:p>
       <w:pPr>
         <w:pStyle w:val="Heading1"/>
@@ -16,7 +16,7 @@
         <w:pStyle w:val="FirstParagraph"/>
       </w:pPr>
       <w:r>
-        <w:t xml:space="preserve">Product Design &amp; Engineering | AI Tools &amp; Complex Workflows</w:t>
+        <w:t xml:space="preserve">Product Design &amp; Engineering</w:t>
       </w:r>
     </w:p>
     <w:p>
@@ -24,13 +24,7 @@
         <w:pStyle w:val="BodyText"/>
       </w:pPr>
       <w:r>
-        <w:t xml:space="preserve">Des Moines, Iowa · Open to relocation</w:t>
-      </w:r>
-      <w:r>
-        <w:br/>
-      </w:r>
-      <w:r>
-        <w:t xml:space="preserve">dbett4@gmail.com · 815.440.1756</w:t>
+        <w:t xml:space="preserve">Des Moines, Iowa · Open to relocation · dbett4@gmail.com · 815.440.1756</w:t>
       </w:r>
       <w:r>
         <w:br/>
@@ -78,54 +72,42 @@
         </w:r>
       </w:hyperlink>
     </w:p>
-    <w:bookmarkStart w:id="23" w:name="summary"/>
+    <w:p>
+      <w:pPr>
+        <w:pStyle w:val="BodyText"/>
+      </w:pPr>
+      <w:r>
+        <w:t xml:space="preserve">I design and build Passal’s study experience and Leasekite’s vehicle comparison and lease-request workflows, working through AI coding tools. My product decisions draw on 10+ years in financial-reporting software and customer delivery.</w:t>
+      </w:r>
+    </w:p>
+    <w:bookmarkStart w:id="32" w:name="selected-product-technical-work"/>
     <w:p>
       <w:pPr>
         <w:pStyle w:val="Heading2"/>
       </w:pPr>
       <w:r>
-        <w:t xml:space="preserve">Summary</w:t>
-      </w:r>
-    </w:p>
-    <w:p>
-      <w:pPr>
-        <w:pStyle w:val="FirstParagraph"/>
-      </w:pPr>
-      <w:r>
-        <w:t xml:space="preserve">Product builder working through AI coding tools from product direction and interface design through implementation and iteration. Own Passal’s study experience and Leasekite’s vehicle comparison and lease-request workflows. Bring 10+ years of financial-reporting and customer-delivery experience to understanding user needs, integration requirements, and complex workflows. Interested in design engineering and product-building roles, including interfaces for AI tools.</w:t>
-      </w:r>
-    </w:p>
-    <w:bookmarkEnd w:id="23"/>
-    <w:bookmarkStart w:id="33" w:name="selected-product-technical-work"/>
-    <w:p>
-      <w:pPr>
-        <w:pStyle w:val="Heading2"/>
-      </w:pPr>
-      <w:r>
         <w:t xml:space="preserve">Selected Product &amp; Technical Work</w:t>
       </w:r>
     </w:p>
-    <w:bookmarkStart w:id="25" w:name="passal-study-product"/>
+    <w:bookmarkStart w:id="24" w:name="passal-study-product"/>
     <w:p>
       <w:pPr>
         <w:pStyle w:val="Heading3"/>
       </w:pPr>
-      <w:r>
-        <w:t xml:space="preserve">Passal — Study product</w:t>
-      </w:r>
-    </w:p>
-    <w:p>
-      <w:pPr>
-        <w:pStyle w:val="FirstParagraph"/>
-      </w:pPr>
-      <w:hyperlink r:id="rId24">
+      <w:hyperlink r:id="rId23">
         <w:r>
           <w:rPr>
             <w:rStyle w:val="Hyperlink"/>
           </w:rPr>
-          <w:t xml:space="preserve">passal.app</w:t>
+          <w:t xml:space="preserve">Passal</w:t>
         </w:r>
       </w:hyperlink>
+      <w:r>
+        <w:t xml:space="preserve"> </w:t>
+      </w:r>
+      <w:r>
+        <w:t xml:space="preserve">— Study product</w:t>
+      </w:r>
     </w:p>
     <w:p>
       <w:pPr>
@@ -136,7 +118,7 @@
         <w:pStyle w:val="Compact"/>
       </w:pPr>
       <w:r>
-        <w:t xml:space="preserve">Own product direction, interface design, and implementation through AI coding tools, connecting lecture sources, study choices, and practice.</w:t>
+        <w:t xml:space="preserve">Own product direction, interface design, and implementation through AI coding tools for a study app that helps students choose what to study next, with practice tied to lecture sources.</w:t>
       </w:r>
     </w:p>
     <w:p>
@@ -148,89 +130,75 @@
         <w:pStyle w:val="Compact"/>
       </w:pPr>
       <w:r>
-        <w:t xml:space="preserve">Shape the workflow around helping students decide what to study next, with practice tied to lecture sources.</w:t>
-      </w:r>
-    </w:p>
-    <w:p>
-      <w:pPr>
-        <w:numPr>
-          <w:ilvl w:val="0"/>
-          <w:numId w:val="1001"/>
-        </w:numPr>
-        <w:pStyle w:val="Compact"/>
-      </w:pPr>
-      <w:r>
         <w:t xml:space="preserve">Project stack: React, Next.js, TypeScript, and SQLite.</w:t>
       </w:r>
     </w:p>
+    <w:bookmarkEnd w:id="24"/>
+    <w:bookmarkStart w:id="25" w:name="leasekite-product-in-development"/>
+    <w:p>
+      <w:pPr>
+        <w:pStyle w:val="Heading3"/>
+      </w:pPr>
+      <w:r>
+        <w:t xml:space="preserve">Leasekite — Product in development</w:t>
+      </w:r>
+    </w:p>
+    <w:p>
+      <w:pPr>
+        <w:numPr>
+          <w:ilvl w:val="0"/>
+          <w:numId w:val="1002"/>
+        </w:numPr>
+        <w:pStyle w:val="Compact"/>
+      </w:pPr>
+      <w:r>
+        <w:t xml:space="preserve">Own product direction, interface design, and implementation through AI coding tools for vehicle comparison and lease-request workflows.</w:t>
+      </w:r>
+    </w:p>
+    <w:p>
+      <w:pPr>
+        <w:numPr>
+          <w:ilvl w:val="0"/>
+          <w:numId w:val="1002"/>
+        </w:numPr>
+        <w:pStyle w:val="Compact"/>
+      </w:pPr>
+      <w:r>
+        <w:t xml:space="preserve">Keep requests as drafts for review and negotiation decisions with the user.</w:t>
+      </w:r>
+    </w:p>
+    <w:p>
+      <w:pPr>
+        <w:numPr>
+          <w:ilvl w:val="0"/>
+          <w:numId w:val="1002"/>
+        </w:numPr>
+        <w:pStyle w:val="Compact"/>
+      </w:pPr>
+      <w:r>
+        <w:t xml:space="preserve">Project stack: HTML, CSS, JavaScript, and Python/SQLite supporting services. In development; private preview.</w:t>
+      </w:r>
+    </w:p>
     <w:bookmarkEnd w:id="25"/>
-    <w:bookmarkStart w:id="26" w:name="leasekite-product-in-development"/>
+    <w:bookmarkStart w:id="27" w:name="X023ebf9608ffcb79592b20d26066519b52a53a7"/>
     <w:p>
       <w:pPr>
         <w:pStyle w:val="Heading3"/>
       </w:pPr>
-      <w:r>
-        <w:t xml:space="preserve">Leasekite — Product in development</w:t>
-      </w:r>
-    </w:p>
-    <w:p>
-      <w:pPr>
-        <w:numPr>
-          <w:ilvl w:val="0"/>
-          <w:numId w:val="1002"/>
-        </w:numPr>
-        <w:pStyle w:val="Compact"/>
-      </w:pPr>
-      <w:r>
-        <w:t xml:space="preserve">Own product direction, interface design, and implementation through AI coding tools for vehicle comparison and lease-request workflows.</w:t>
-      </w:r>
-    </w:p>
-    <w:p>
-      <w:pPr>
-        <w:numPr>
-          <w:ilvl w:val="0"/>
-          <w:numId w:val="1002"/>
-        </w:numPr>
-        <w:pStyle w:val="Compact"/>
-      </w:pPr>
-      <w:r>
-        <w:t xml:space="preserve">Keep requests as drafts for review and negotiation decisions with the user.</w:t>
-      </w:r>
-    </w:p>
-    <w:p>
-      <w:pPr>
-        <w:numPr>
-          <w:ilvl w:val="0"/>
-          <w:numId w:val="1002"/>
-        </w:numPr>
-        <w:pStyle w:val="Compact"/>
-      </w:pPr>
-      <w:r>
-        <w:t xml:space="preserve">Project stack: HTML, CSS, JavaScript, and Python/SQLite supporting services. In development; private preview.</w:t>
-      </w:r>
-    </w:p>
-    <w:bookmarkEnd w:id="26"/>
-    <w:bookmarkStart w:id="28" w:name="Xabbb9e80bbbb9b51b8083995572b5f1dc3fcfa8"/>
-    <w:p>
-      <w:pPr>
-        <w:pStyle w:val="Heading3"/>
-      </w:pPr>
-      <w:r>
-        <w:t xml:space="preserve">Accounting Acceptance Lab — Synthetic accounting evaluation</w:t>
-      </w:r>
-    </w:p>
-    <w:p>
-      <w:pPr>
-        <w:pStyle w:val="FirstParagraph"/>
-      </w:pPr>
-      <w:hyperlink r:id="rId27">
+      <w:hyperlink r:id="rId26">
         <w:r>
           <w:rPr>
             <w:rStyle w:val="Hyperlink"/>
           </w:rPr>
-          <w:t xml:space="preserve">github.com/dbett4/accounting-acceptance-lab</w:t>
+          <w:t xml:space="preserve">Accounting Acceptance Lab</w:t>
         </w:r>
       </w:hyperlink>
+      <w:r>
+        <w:t xml:space="preserve"> </w:t>
+      </w:r>
+      <w:r>
+        <w:t xml:space="preserve">— Synthetic evaluation</w:t>
+      </w:r>
     </w:p>
     <w:p>
       <w:pPr>
@@ -244,28 +212,26 @@
         <w:t xml:space="preserve">Built a Python/SQLite lab that tests accounting agents on synthetic reconciliation cases, including supporting evidence, approval before changes, and recovery from failed writes.</w:t>
       </w:r>
     </w:p>
-    <w:bookmarkEnd w:id="28"/>
-    <w:bookmarkStart w:id="30" w:name="X55a4a08b4bcdaa02459ee593ff6849dd07daa8d"/>
+    <w:bookmarkEnd w:id="27"/>
+    <w:bookmarkStart w:id="29" w:name="X55a4a08b4bcdaa02459ee593ff6849dd07daa8d"/>
     <w:p>
       <w:pPr>
         <w:pStyle w:val="Heading3"/>
       </w:pPr>
-      <w:r>
-        <w:t xml:space="preserve">Regulated Reporting MCP — Mock-data integration demo</w:t>
-      </w:r>
-    </w:p>
-    <w:p>
-      <w:pPr>
-        <w:pStyle w:val="FirstParagraph"/>
-      </w:pPr>
-      <w:hyperlink r:id="rId29">
+      <w:hyperlink r:id="rId28">
         <w:r>
           <w:rPr>
             <w:rStyle w:val="Hyperlink"/>
           </w:rPr>
-          <w:t xml:space="preserve">github.com/dbett4/regulated-reporting-mcp</w:t>
+          <w:t xml:space="preserve">Regulated Reporting MCP</w:t>
         </w:r>
       </w:hyperlink>
+      <w:r>
+        <w:t xml:space="preserve"> </w:t>
+      </w:r>
+      <w:r>
+        <w:t xml:space="preserve">— Mock-data integration demo</w:t>
+      </w:r>
     </w:p>
     <w:p>
       <w:pPr>
@@ -279,28 +245,26 @@
         <w:t xml:space="preserve">Built an MCP server for AI access to reporting APIs through OAuth, with caller confirmation and verification according to each tool’s contract. Public demo uses mock data.</w:t>
       </w:r>
     </w:p>
-    <w:bookmarkEnd w:id="30"/>
-    <w:bookmarkStart w:id="32" w:name="lockfield-workiva-consulting-practice"/>
+    <w:bookmarkEnd w:id="29"/>
+    <w:bookmarkStart w:id="31" w:name="lockfield-workiva-consulting-practice"/>
     <w:p>
       <w:pPr>
         <w:pStyle w:val="Heading3"/>
       </w:pPr>
-      <w:r>
-        <w:t xml:space="preserve">Lockfield — Workiva consulting practice</w:t>
-      </w:r>
-    </w:p>
-    <w:p>
-      <w:pPr>
-        <w:pStyle w:val="FirstParagraph"/>
-      </w:pPr>
-      <w:hyperlink r:id="rId31">
+      <w:hyperlink r:id="rId30">
         <w:r>
           <w:rPr>
             <w:rStyle w:val="Hyperlink"/>
           </w:rPr>
-          <w:t xml:space="preserve">lockfield.co</w:t>
+          <w:t xml:space="preserve">Lockfield</w:t>
         </w:r>
       </w:hyperlink>
+      <w:r>
+        <w:t xml:space="preserve"> </w:t>
+      </w:r>
+      <w:r>
+        <w:t xml:space="preserve">— Workiva consulting practice</w:t>
+      </w:r>
     </w:p>
     <w:p>
       <w:pPr>
@@ -314,276 +278,27 @@
         <w:t xml:space="preserve">Shaped the positioning, website, and reporting resources around training and client ownership.</w:t>
       </w:r>
     </w:p>
+    <w:bookmarkEnd w:id="31"/>
     <w:bookmarkEnd w:id="32"/>
+    <w:bookmarkStart w:id="33" w:name="tools"/>
+    <w:p>
+      <w:pPr>
+        <w:pStyle w:val="Heading2"/>
+      </w:pPr>
+      <w:r>
+        <w:t xml:space="preserve">Tools</w:t>
+      </w:r>
+    </w:p>
+    <w:p>
+      <w:pPr>
+        <w:pStyle w:val="FirstParagraph"/>
+      </w:pPr>
+      <w:r>
+        <w:t xml:space="preserve">React, Next.js, TypeScript, HTML/CSS/JavaScript, Python, SQL/SQLite, REST APIs, OAuth/SSO, MCP, Docker Compose, and GitHub Actions. Development uses AI coding tools throughout.</w:t>
+      </w:r>
+    </w:p>
     <w:bookmarkEnd w:id="33"/>
-    <w:bookmarkStart w:id="34" w:name="tools"/>
-    <w:p>
-      <w:pPr>
-        <w:pStyle w:val="Heading2"/>
-      </w:pPr>
-      <w:r>
-        <w:t xml:space="preserve">Tools</w:t>
-      </w:r>
-    </w:p>
-    <w:p>
-      <w:pPr>
-        <w:pStyle w:val="FirstParagraph"/>
-      </w:pPr>
-      <w:r>
-        <w:t xml:space="preserve">React, Next.js, TypeScript, HTML/CSS/JavaScript, Python, SQL/SQLite, REST APIs, OAuth/SSO, MCP, Docker Compose, and GitHub Actions. Development uses AI coding tools throughout.</w:t>
-      </w:r>
-    </w:p>
-    <w:p>
-      <w:pPr>
-        <w:pageBreakBefore/>
-      </w:pPr>
-    </w:p>
-    <w:bookmarkEnd w:id="34"/>
-    <w:bookmarkStart w:id="40" w:name="experience"/>
-    <w:p>
-      <w:pPr>
-        <w:pStyle w:val="Heading2"/>
-      </w:pPr>
-      <w:r>
-        <w:t xml:space="preserve">Experience</w:t>
-      </w:r>
-    </w:p>
-    <w:bookmarkStart w:id="35" w:name="lsl-llp-senior-manager"/>
-    <w:p>
-      <w:pPr>
-        <w:pStyle w:val="Heading3"/>
-      </w:pPr>
-      <w:r>
-        <w:t xml:space="preserve">LSL, LLP — Senior Manager</w:t>
-      </w:r>
-    </w:p>
-    <w:p>
-      <w:pPr>
-        <w:pStyle w:val="FirstParagraph"/>
-      </w:pPr>
-      <w:r>
-        <w:t xml:space="preserve">Nov 2025–Present</w:t>
-      </w:r>
-    </w:p>
-    <w:p>
-      <w:pPr>
-        <w:numPr>
-          <w:ilvl w:val="0"/>
-          <w:numId w:val="1006"/>
-        </w:numPr>
-        <w:pStyle w:val="Compact"/>
-      </w:pPr>
-      <w:r>
-        <w:t xml:space="preserve">Lead Workiva delivery for city and county finance teams, mapping source-ledger data into financial reports and budget books and running user sessions and testing through client sign-off.</w:t>
-      </w:r>
-    </w:p>
-    <w:p>
-      <w:pPr>
-        <w:numPr>
-          <w:ilvl w:val="0"/>
-          <w:numId w:val="1006"/>
-        </w:numPr>
-        <w:pStyle w:val="Compact"/>
-      </w:pPr>
-      <w:r>
-        <w:t xml:space="preserve">Scope consulting engagements, prepare estimates and statements of work, respond to RFPs, and demonstrate proposed solutions to customers.</w:t>
-      </w:r>
-    </w:p>
-    <w:p>
-      <w:pPr>
-        <w:numPr>
-          <w:ilvl w:val="0"/>
-          <w:numId w:val="1006"/>
-        </w:numPr>
-        <w:pStyle w:val="Compact"/>
-      </w:pPr>
-      <w:r>
-        <w:t xml:space="preserve">Reset implementation expectations around client ownership: our team would enable the client team and help them become comfortable doing the work themselves.</w:t>
-      </w:r>
-    </w:p>
-    <w:p>
-      <w:pPr>
-        <w:numPr>
-          <w:ilvl w:val="0"/>
-          <w:numId w:val="1006"/>
-        </w:numPr>
-        <w:pStyle w:val="Compact"/>
-      </w:pPr>
-      <w:r>
-        <w:t xml:space="preserve">Develop Python tools that generate Workiva data links, formulas, and validation checks from client ledgers, reused across financial-reporting and budgeting engagements.</w:t>
-      </w:r>
-    </w:p>
-    <w:p>
-      <w:pPr>
-        <w:numPr>
-          <w:ilvl w:val="0"/>
-          <w:numId w:val="1006"/>
-        </w:numPr>
-        <w:pStyle w:val="Compact"/>
-      </w:pPr>
-      <w:r>
-        <w:t xml:space="preserve">Build AI-assisted workflows that compare reports with source records and flag accounting discrepancies for review, with human review before client changes.</w:t>
-      </w:r>
-    </w:p>
-    <w:bookmarkEnd w:id="35"/>
-    <w:bookmarkStart w:id="36" w:name="X2788b6bbaadc881c547b04acf52e15d9c15e896"/>
-    <w:p>
-      <w:pPr>
-        <w:pStyle w:val="Heading3"/>
-      </w:pPr>
-      <w:r>
-        <w:t xml:space="preserve">Citrin Cooperman — Manager of Digital Services, Workiva</w:t>
-      </w:r>
-    </w:p>
-    <w:p>
-      <w:pPr>
-        <w:pStyle w:val="FirstParagraph"/>
-      </w:pPr>
-      <w:r>
-        <w:t xml:space="preserve">Dec 2024–Oct 2025</w:t>
-      </w:r>
-    </w:p>
-    <w:p>
-      <w:pPr>
-        <w:numPr>
-          <w:ilvl w:val="0"/>
-          <w:numId w:val="1007"/>
-        </w:numPr>
-        <w:pStyle w:val="Compact"/>
-      </w:pPr>
-      <w:r>
-        <w:t xml:space="preserve">Managed a five-person Workiva implementation team. Coached consultants, resolved customer escalations, and led testing and training through go-live.</w:t>
-      </w:r>
-    </w:p>
-    <w:p>
-      <w:pPr>
-        <w:numPr>
-          <w:ilvl w:val="0"/>
-          <w:numId w:val="1007"/>
-        </w:numPr>
-        <w:pStyle w:val="Compact"/>
-      </w:pPr>
-      <w:r>
-        <w:t xml:space="preserve">Led a data-collection and reporting implementation with bidirectional API integration to the customer’s system of record, SSO, and an audit trail. Led user acceptance testing through go-live and executive sign-off.</w:t>
-      </w:r>
-    </w:p>
-    <w:bookmarkEnd w:id="36"/>
-    <w:bookmarkStart w:id="37" w:name="workiva-solutions-architect"/>
-    <w:p>
-      <w:pPr>
-        <w:pStyle w:val="Heading3"/>
-      </w:pPr>
-      <w:r>
-        <w:t xml:space="preserve">Workiva — Solutions Architect</w:t>
-      </w:r>
-    </w:p>
-    <w:p>
-      <w:pPr>
-        <w:pStyle w:val="FirstParagraph"/>
-      </w:pPr>
-      <w:r>
-        <w:t xml:space="preserve">Oct 2022–Oct 2024</w:t>
-      </w:r>
-    </w:p>
-    <w:p>
-      <w:pPr>
-        <w:numPr>
-          <w:ilvl w:val="0"/>
-          <w:numId w:val="1008"/>
-        </w:numPr>
-        <w:pStyle w:val="Compact"/>
-      </w:pPr>
-      <w:r>
-        <w:t xml:space="preserve">Led 6–12 concurrent financial-reporting and governance, risk, and compliance implementations from customer onboarding through production use.</w:t>
-      </w:r>
-    </w:p>
-    <w:p>
-      <w:pPr>
-        <w:numPr>
-          <w:ilvl w:val="0"/>
-          <w:numId w:val="1008"/>
-        </w:numPr>
-        <w:pStyle w:val="Compact"/>
-      </w:pPr>
-      <w:r>
-        <w:t xml:space="preserve">Ran requirements workshops and translated reporting, data, and access needs into implementation designs and test plans, including API, SSO, and ERP integration requirements.</w:t>
-      </w:r>
-    </w:p>
-    <w:p>
-      <w:pPr>
-        <w:numPr>
-          <w:ilvl w:val="0"/>
-          <w:numId w:val="1008"/>
-        </w:numPr>
-        <w:pStyle w:val="Compact"/>
-      </w:pPr>
-      <w:r>
-        <w:t xml:space="preserve">Worked with Sales and Customer Success on technical evaluations and delivery handoffs. Brought recurring customer issues to Product and Engineering and developed repeatable delivery guidance.</w:t>
-      </w:r>
-    </w:p>
-    <w:bookmarkEnd w:id="37"/>
-    <w:bookmarkStart w:id="38" w:name="ambra-health-solutions-consultant"/>
-    <w:p>
-      <w:pPr>
-        <w:pStyle w:val="Heading3"/>
-      </w:pPr>
-      <w:r>
-        <w:t xml:space="preserve">Ambra Health — Solutions Consultant</w:t>
-      </w:r>
-    </w:p>
-    <w:p>
-      <w:pPr>
-        <w:pStyle w:val="FirstParagraph"/>
-      </w:pPr>
-      <w:r>
-        <w:t xml:space="preserve">Sep 2021–Oct 2022</w:t>
-      </w:r>
-    </w:p>
-    <w:p>
-      <w:pPr>
-        <w:numPr>
-          <w:ilvl w:val="0"/>
-          <w:numId w:val="1009"/>
-        </w:numPr>
-        <w:pStyle w:val="Compact"/>
-      </w:pPr>
-      <w:r>
-        <w:t xml:space="preserve">Implemented medical-imaging and EHR workflows in HIPAA-controlled environments. Worked with customer IT teams to resolve API, SFTP, webhook, and access issues through go-live.</w:t>
-      </w:r>
-    </w:p>
-    <w:bookmarkEnd w:id="38"/>
-    <w:bookmarkStart w:id="39" w:name="workiva-sec-reporting-consultant"/>
-    <w:p>
-      <w:pPr>
-        <w:pStyle w:val="Heading3"/>
-      </w:pPr>
-      <w:r>
-        <w:t xml:space="preserve">Workiva — SEC Reporting Consultant</w:t>
-      </w:r>
-    </w:p>
-    <w:p>
-      <w:pPr>
-        <w:pStyle w:val="FirstParagraph"/>
-      </w:pPr>
-      <w:r>
-        <w:t xml:space="preserve">Sep 2015–Sep 2021</w:t>
-      </w:r>
-    </w:p>
-    <w:p>
-      <w:pPr>
-        <w:numPr>
-          <w:ilvl w:val="0"/>
-          <w:numId w:val="1010"/>
-        </w:numPr>
-        <w:pStyle w:val="Compact"/>
-      </w:pPr>
-      <w:r>
-        <w:t xml:space="preserve">Delivered SEC reporting and XBRL services for 20+ public-company customers each quarter. Managed review cycles, resolved reporting issues, and helped customers meet filing deadlines.</w:t>
-      </w:r>
-    </w:p>
-    <w:bookmarkEnd w:id="39"/>
-    <w:bookmarkEnd w:id="40"/>
-    <w:bookmarkStart w:id="41" w:name="education"/>
+    <w:bookmarkStart w:id="34" w:name="education"/>
     <w:p>
       <w:pPr>
         <w:pStyle w:val="Heading2"/>
@@ -610,12 +325,260 @@
         <w:t xml:space="preserve">— Master of Accounting, 2017 · B.S. Accounting, 2016</w:t>
       </w:r>
     </w:p>
+    <w:p>
+      <w:pPr>
+        <w:pageBreakBefore/>
+      </w:pPr>
+    </w:p>
+    <w:bookmarkEnd w:id="34"/>
+    <w:bookmarkStart w:id="40" w:name="experience"/>
+    <w:p>
+      <w:pPr>
+        <w:pStyle w:val="Heading2"/>
+      </w:pPr>
+      <w:r>
+        <w:t xml:space="preserve">Experience</w:t>
+      </w:r>
+    </w:p>
+    <w:bookmarkStart w:id="35" w:name="lsl-llp-senior-manager"/>
+    <w:p>
+      <w:pPr>
+        <w:pStyle w:val="Heading3"/>
+      </w:pPr>
+      <w:r>
+        <w:t xml:space="preserve">LSL, LLP — Senior Manager</w:t>
+      </w:r>
+    </w:p>
+    <w:p>
+      <w:pPr>
+        <w:pStyle w:val="FirstParagraph"/>
+      </w:pPr>
+      <w:r>
+        <w:t xml:space="preserve">Nov 2025–Present</w:t>
+      </w:r>
+    </w:p>
+    <w:p>
+      <w:pPr>
+        <w:numPr>
+          <w:ilvl w:val="0"/>
+          <w:numId w:val="1006"/>
+        </w:numPr>
+        <w:pStyle w:val="Compact"/>
+      </w:pPr>
+      <w:r>
+        <w:t xml:space="preserve">Lead Workiva delivery for city and county finance teams, mapping source-ledger data into financial reports and budget books and running user sessions and testing through client sign-off.</w:t>
+      </w:r>
+    </w:p>
+    <w:p>
+      <w:pPr>
+        <w:numPr>
+          <w:ilvl w:val="0"/>
+          <w:numId w:val="1006"/>
+        </w:numPr>
+        <w:pStyle w:val="Compact"/>
+      </w:pPr>
+      <w:r>
+        <w:t xml:space="preserve">Scope consulting engagements, prepare estimates and statements of work, respond to RFPs, and demonstrate proposed solutions to customers.</w:t>
+      </w:r>
+    </w:p>
+    <w:p>
+      <w:pPr>
+        <w:numPr>
+          <w:ilvl w:val="0"/>
+          <w:numId w:val="1006"/>
+        </w:numPr>
+        <w:pStyle w:val="Compact"/>
+      </w:pPr>
+      <w:r>
+        <w:t xml:space="preserve">Reset implementation expectations around client ownership: our team would enable the client team and help them become comfortable doing the work themselves.</w:t>
+      </w:r>
+    </w:p>
+    <w:p>
+      <w:pPr>
+        <w:numPr>
+          <w:ilvl w:val="0"/>
+          <w:numId w:val="1006"/>
+        </w:numPr>
+        <w:pStyle w:val="Compact"/>
+      </w:pPr>
+      <w:r>
+        <w:t xml:space="preserve">Develop Python tools that generate Workiva data links, formulas, and validation checks from client ledgers, reused across financial-reporting and budgeting engagements.</w:t>
+      </w:r>
+    </w:p>
+    <w:p>
+      <w:pPr>
+        <w:numPr>
+          <w:ilvl w:val="0"/>
+          <w:numId w:val="1006"/>
+        </w:numPr>
+        <w:pStyle w:val="Compact"/>
+      </w:pPr>
+      <w:r>
+        <w:t xml:space="preserve">Build AI-assisted workflows that compare reports with source records and flag accounting discrepancies for review, with human review before client changes.</w:t>
+      </w:r>
+    </w:p>
+    <w:bookmarkEnd w:id="35"/>
+    <w:bookmarkStart w:id="36" w:name="X2788b6bbaadc881c547b04acf52e15d9c15e896"/>
+    <w:p>
+      <w:pPr>
+        <w:pStyle w:val="Heading3"/>
+      </w:pPr>
+      <w:r>
+        <w:t xml:space="preserve">Citrin Cooperman — Manager of Digital Services, Workiva</w:t>
+      </w:r>
+    </w:p>
+    <w:p>
+      <w:pPr>
+        <w:pStyle w:val="FirstParagraph"/>
+      </w:pPr>
+      <w:r>
+        <w:t xml:space="preserve">Dec 2024–Oct 2025</w:t>
+      </w:r>
+    </w:p>
+    <w:p>
+      <w:pPr>
+        <w:numPr>
+          <w:ilvl w:val="0"/>
+          <w:numId w:val="1007"/>
+        </w:numPr>
+        <w:pStyle w:val="Compact"/>
+      </w:pPr>
+      <w:r>
+        <w:t xml:space="preserve">Managed a five-person Workiva implementation team. Coached consultants, resolved customer escalations, and led testing and training through go-live.</w:t>
+      </w:r>
+    </w:p>
+    <w:p>
+      <w:pPr>
+        <w:numPr>
+          <w:ilvl w:val="0"/>
+          <w:numId w:val="1007"/>
+        </w:numPr>
+        <w:pStyle w:val="Compact"/>
+      </w:pPr>
+      <w:r>
+        <w:t xml:space="preserve">Led a data-collection and reporting implementation with bidirectional API integration to the customer’s system of record, SSO, and an audit trail. Led user acceptance testing through go-live and executive sign-off.</w:t>
+      </w:r>
+    </w:p>
+    <w:bookmarkEnd w:id="36"/>
+    <w:bookmarkStart w:id="37" w:name="workiva-solutions-architect"/>
+    <w:p>
+      <w:pPr>
+        <w:pStyle w:val="Heading3"/>
+      </w:pPr>
+      <w:r>
+        <w:t xml:space="preserve">Workiva — Solutions Architect</w:t>
+      </w:r>
+    </w:p>
+    <w:p>
+      <w:pPr>
+        <w:pStyle w:val="FirstParagraph"/>
+      </w:pPr>
+      <w:r>
+        <w:t xml:space="preserve">Oct 2022–Oct 2024</w:t>
+      </w:r>
+    </w:p>
+    <w:p>
+      <w:pPr>
+        <w:numPr>
+          <w:ilvl w:val="0"/>
+          <w:numId w:val="1008"/>
+        </w:numPr>
+        <w:pStyle w:val="Compact"/>
+      </w:pPr>
+      <w:r>
+        <w:t xml:space="preserve">Led 6–12 concurrent financial-reporting and governance, risk, and compliance implementations from customer onboarding through production use.</w:t>
+      </w:r>
+    </w:p>
+    <w:p>
+      <w:pPr>
+        <w:numPr>
+          <w:ilvl w:val="0"/>
+          <w:numId w:val="1008"/>
+        </w:numPr>
+        <w:pStyle w:val="Compact"/>
+      </w:pPr>
+      <w:r>
+        <w:t xml:space="preserve">Ran requirements workshops and translated reporting, data, and access needs into implementation designs and test plans, including API, SSO, and ERP integration requirements.</w:t>
+      </w:r>
+    </w:p>
+    <w:p>
+      <w:pPr>
+        <w:numPr>
+          <w:ilvl w:val="0"/>
+          <w:numId w:val="1008"/>
+        </w:numPr>
+        <w:pStyle w:val="Compact"/>
+      </w:pPr>
+      <w:r>
+        <w:t xml:space="preserve">Worked with Sales and Customer Success on technical evaluations and delivery handoffs. Brought recurring customer issues to Product and Engineering and developed repeatable delivery guidance.</w:t>
+      </w:r>
+    </w:p>
+    <w:bookmarkEnd w:id="37"/>
+    <w:bookmarkStart w:id="38" w:name="ambra-health-solutions-consultant"/>
+    <w:p>
+      <w:pPr>
+        <w:pStyle w:val="Heading3"/>
+      </w:pPr>
+      <w:r>
+        <w:t xml:space="preserve">Ambra Health — Solutions Consultant</w:t>
+      </w:r>
+    </w:p>
+    <w:p>
+      <w:pPr>
+        <w:pStyle w:val="FirstParagraph"/>
+      </w:pPr>
+      <w:r>
+        <w:t xml:space="preserve">Sep 2021–Oct 2022</w:t>
+      </w:r>
+    </w:p>
+    <w:p>
+      <w:pPr>
+        <w:numPr>
+          <w:ilvl w:val="0"/>
+          <w:numId w:val="1009"/>
+        </w:numPr>
+        <w:pStyle w:val="Compact"/>
+      </w:pPr>
+      <w:r>
+        <w:t xml:space="preserve">Implemented medical-imaging and EHR workflows in HIPAA-controlled environments. Worked with customer IT teams to resolve API, SFTP, webhook, and access issues through go-live.</w:t>
+      </w:r>
+    </w:p>
+    <w:bookmarkEnd w:id="38"/>
+    <w:bookmarkStart w:id="39" w:name="workiva-sec-reporting-consultant"/>
+    <w:p>
+      <w:pPr>
+        <w:pStyle w:val="Heading3"/>
+      </w:pPr>
+      <w:r>
+        <w:t xml:space="preserve">Workiva — SEC Reporting Consultant</w:t>
+      </w:r>
+    </w:p>
+    <w:p>
+      <w:pPr>
+        <w:pStyle w:val="FirstParagraph"/>
+      </w:pPr>
+      <w:r>
+        <w:t xml:space="preserve">Sep 2015–Sep 2021</w:t>
+      </w:r>
+    </w:p>
+    <w:p>
+      <w:pPr>
+        <w:numPr>
+          <w:ilvl w:val="0"/>
+          <w:numId w:val="1010"/>
+        </w:numPr>
+        <w:pStyle w:val="Compact"/>
+      </w:pPr>
+      <w:r>
+        <w:t xml:space="preserve">Delivered SEC reporting and XBRL services for 20+ public-company customers each quarter. Managed review cycles, resolved reporting issues, and helped customers meet filing deadlines.</w:t>
+      </w:r>
+    </w:p>
+    <w:bookmarkEnd w:id="39"/>
+    <w:bookmarkEnd w:id="40"/>
     <w:bookmarkEnd w:id="41"/>
-    <w:bookmarkEnd w:id="42"/>
     <w:sectPr>
-      <w:footerReference w:type="default" r:id="rIdCareerFooter"/>
       <w:pgSz w:h="15840" w:w="12240"/>
-      <w:pgMar w:bottom="864" w:footer="540" w:gutter="0" w:header="360" w:left="864" w:right="864" w:top="864"/>
+      <w:pgMar w:bottom="820" w:footer="0" w:gutter="0" w:header="0" w:left="864" w:right="864" w:top="820"/>
     </w:sectPr>
   </w:body>
 </w:document>
@@ -623,33 +586,6 @@
 
 <file path=word/comments.xml><?xml version="1.0" encoding="utf-8"?>
 <w:comments xmlns:w="http://schemas.openxmlformats.org/wordprocessingml/2006/main" xmlns:m="http://schemas.openxmlformats.org/officeDocument/2006/math" xmlns:r="http://schemas.openxmlformats.org/officeDocument/2006/relationships" xmlns:o="urn:schemas-microsoft-com:office:office" xmlns:v="urn:schemas-microsoft-com:vml" xmlns:w10="urn:schemas-microsoft-com:office:word" xmlns:a="http://schemas.openxmlformats.org/drawingml/2006/main" xmlns:pic="http://schemas.openxmlformats.org/drawingml/2006/picture" xmlns:wp="http://schemas.openxmlformats.org/drawingml/2006/wordprocessingDrawing"/>
-</file>
-
-<file path=word/footer1.xml><?xml version="1.0" encoding="utf-8"?>
-<w:ftr xmlns:w="http://schemas.openxmlformats.org/wordprocessingml/2006/main">
-  <w:p>
-    <w:pPr>
-      <w:jc w:val="right"/>
-    </w:pPr>
-    <w:r>
-      <w:rPr>
-        <w:rFonts w:ascii="Arial" w:hAnsi="Arial"/>
-        <w:sz w:val="18"/>
-        <w:color w:val="666666"/>
-      </w:rPr>
-      <w:t xml:space="preserve">Dave Bettner · davebettner.com · </w:t>
-    </w:r>
-    <w:fldSimple w:instr="PAGE">
-      <w:r>
-        <w:rPr>
-          <w:sz w:val="18"/>
-          <w:color w:val="666666"/>
-        </w:rPr>
-        <w:t>1</w:t>
-      </w:r>
-    </w:fldSimple>
-  </w:p>
-</w:ftr>
 </file>
 
 <file path=word/footnotes.xml><?xml version="1.0" encoding="utf-8"?>
@@ -866,7 +802,7 @@
   <w:docDefaults>
     <w:rPrDefault>
       <w:rPr>
-        <w:rFonts w:ascii="Times New Roman" w:asciiTheme="minorHAnsi" w:cs="Times New Roman" w:cstheme="minorBidi" w:eastAsiaTheme="minorHAnsi" w:hAnsi="Times New Roman" w:hAnsiTheme="minorHAnsi"/>
+        <w:rFonts w:ascii="Manrope" w:asciiTheme="minorHAnsi" w:cs="Manrope" w:cstheme="minorBidi" w:eastAsiaTheme="minorHAnsi" w:hAnsi="Manrope" w:hAnsiTheme="minorHAnsi"/>
         <w:sz w:val="21"/>
         <w:szCs w:val="24"/>
         <w:lang w:bidi="ar-SA" w:eastAsia="en-US" w:val="en-US"/>
@@ -875,7 +811,7 @@
     </w:rPrDefault>
     <w:pPrDefault>
       <w:pPr>
-        <w:spacing w:after="80" w:before="0" w:line="255" w:lineRule="auto"/>
+        <w:spacing w:after="80" w:before="0" w:line="265" w:lineRule="auto"/>
       </w:pPr>
     </w:pPrDefault>
   </w:docDefaults>
@@ -884,11 +820,11 @@
     <w:name w:val="Normal"/>
     <w:qFormat/>
     <w:rPr>
-      <w:rFonts w:ascii="Times New Roman" w:cs="Times New Roman" w:hAnsi="Times New Roman"/>
+      <w:rFonts w:ascii="Manrope" w:cs="Manrope" w:hAnsi="Manrope"/>
       <w:sz w:val="21"/>
     </w:rPr>
     <w:pPr>
-      <w:spacing w:after="65" w:before="0" w:line="255" w:lineRule="auto"/>
+      <w:spacing w:after="75" w:before="0" w:line="265" w:lineRule="auto"/>
     </w:pPr>
   </w:style>
   <w:style w:styleId="BodyText" w:type="paragraph">
@@ -896,11 +832,11 @@
     <w:basedOn w:val="Normal"/>
     <w:link w:val="BodyTextChar"/>
     <w:pPr>
-      <w:spacing w:after="65" w:before="0" w:line="255" w:lineRule="auto"/>
-    </w:pPr>
-    <w:qFormat/>
-    <w:rPr>
-      <w:rFonts w:ascii="Times New Roman" w:cs="Times New Roman" w:hAnsi="Times New Roman"/>
+      <w:spacing w:after="75" w:before="0" w:line="265" w:lineRule="auto"/>
+    </w:pPr>
+    <w:qFormat/>
+    <w:rPr>
+      <w:rFonts w:ascii="Manrope" w:cs="Manrope" w:hAnsi="Manrope"/>
       <w:sz w:val="21"/>
     </w:rPr>
   </w:style>
@@ -910,11 +846,11 @@
     <w:next w:val="BodyText"/>
     <w:qFormat/>
     <w:rPr>
-      <w:rFonts w:ascii="Times New Roman" w:cs="Times New Roman" w:hAnsi="Times New Roman"/>
+      <w:rFonts w:ascii="Manrope" w:cs="Manrope" w:hAnsi="Manrope"/>
       <w:sz w:val="21"/>
     </w:rPr>
     <w:pPr>
-      <w:spacing w:after="65" w:before="0" w:line="255" w:lineRule="auto"/>
+      <w:spacing w:after="75" w:before="0" w:line="265" w:lineRule="auto"/>
     </w:pPr>
   </w:style>
   <w:style w:customStyle="1" w:styleId="Compact" w:type="paragraph">
@@ -922,10 +858,10 @@
     <w:basedOn w:val="BodyText"/>
     <w:qFormat/>
     <w:pPr>
-      <w:spacing w:after="65" w:before="0" w:line="255" w:lineRule="auto"/>
-    </w:pPr>
-    <w:rPr>
-      <w:rFonts w:ascii="Times New Roman" w:cs="Times New Roman" w:hAnsi="Times New Roman"/>
+      <w:spacing w:after="75" w:before="0" w:line="265" w:lineRule="auto"/>
+    </w:pPr>
+    <w:rPr>
+      <w:rFonts w:ascii="Manrope" w:cs="Manrope" w:hAnsi="Manrope"/>
       <w:sz w:val="21"/>
     </w:rPr>
   </w:style>
@@ -1036,15 +972,15 @@
     <w:pPr>
       <w:keepNext/>
       <w:keepLines/>
-      <w:spacing w:after="65" w:before="0"/>
+      <w:spacing w:after="70" w:before="0"/>
       <w:outlineLvl w:val="0"/>
     </w:pPr>
     <w:rPr>
-      <w:rFonts w:ascii="Arial" w:cstheme="majorBidi" w:hAnsi="Arial"/>
+      <w:rFonts w:ascii="Manrope" w:cstheme="majorBidi" w:hAnsi="Manrope"/>
       <w:b/>
       <w:bCs/>
       <w:color w:themeColor="accent1" w:val="181818"/>
-      <w:sz w:val="46"/>
+      <w:sz w:val="48"/>
       <w:szCs w:val="32"/>
     </w:rPr>
   </w:style>
@@ -1058,11 +994,11 @@
     <w:pPr>
       <w:keepNext/>
       <w:keepLines/>
-      <w:spacing w:after="65" w:before="180"/>
+      <w:spacing w:after="70" w:before="200"/>
       <w:outlineLvl w:val="1"/>
     </w:pPr>
     <w:rPr>
-      <w:rFonts w:ascii="Arial" w:cstheme="majorBidi" w:hAnsi="Arial"/>
+      <w:rFonts w:ascii="Manrope" w:cstheme="majorBidi" w:hAnsi="Manrope"/>
       <w:b/>
       <w:bCs/>
       <w:color w:themeColor="accent1" w:val="181818"/>
@@ -1080,11 +1016,11 @@
     <w:pPr>
       <w:keepNext/>
       <w:keepLines/>
-      <w:spacing w:after="65" w:before="110"/>
+      <w:spacing w:after="70" w:before="120"/>
       <w:outlineLvl w:val="2"/>
     </w:pPr>
     <w:rPr>
-      <w:rFonts w:ascii="Arial" w:cstheme="majorBidi" w:hAnsi="Arial"/>
+      <w:rFonts w:ascii="Manrope" w:cstheme="majorBidi" w:hAnsi="Manrope"/>
       <w:b/>
       <w:bCs/>
       <w:color w:themeColor="accent1" w:val="181818"/>
@@ -1349,7 +1285,7 @@
     <w:name w:val="Hyperlink"/>
     <w:basedOn w:val="BodyTextChar"/>
     <w:rPr>
-      <w:color w:themeColor="accent1" w:val="24455C"/>
+      <w:color w:themeColor="accent1" w:val="202A35"/>
     </w:rPr>
   </w:style>
   <w:style w:styleId="TOCHeading" w:type="paragraph">

</xml_diff>

<commit_message>
Clarify profile headline and quantify internal workflow coverage
</commit_message>
<xml_diff>
--- a/resume/dave-bettner-design-engineering.docx
+++ b/resume/dave-bettner-design-engineering.docx
@@ -16,7 +16,7 @@
         <w:pStyle w:val="FirstParagraph"/>
       </w:pPr>
       <w:r>
-        <w:t xml:space="preserve">Product Design &amp; Engineering</w:t>
+        <w:t xml:space="preserve">Enterprise Implementation &amp; AI Workflow Leader | Finance Systems | Python</w:t>
       </w:r>
     </w:p>
     <w:p>
@@ -77,7 +77,7 @@
         <w:pStyle w:val="BodyText"/>
       </w:pPr>
       <w:r>
-        <w:t xml:space="preserve">I design and build Passal’s study experience and Leasekite’s vehicle comparison and lease-request workflows, working through AI coding tools. My product decisions draw on 10+ years in financial-reporting software and customer delivery.</w:t>
+        <w:t xml:space="preserve">I lead enterprise software implementations and build Python tools and internal AI-assisted workflows for finance teams. My work draws on 10+ years in financial-reporting software and customer delivery. I also design and build Passal and Leasekite through AI coding tools.</w:t>
       </w:r>
     </w:p>
     <w:bookmarkStart w:id="32" w:name="selected-product-technical-work"/>
@@ -414,7 +414,7 @@
         <w:pStyle w:val="Compact"/>
       </w:pPr>
       <w:r>
-        <w:t xml:space="preserve">Build AI-assisted workflows that compare reports with source records and flag accounting discrepancies for review, with human review before client changes.</w:t>
+        <w:t xml:space="preserve">Built an internal AI-assisted cash-flow review workflow covering 11 source workpapers with 69 automated arithmetic checks, flagging discrepancies for human review. Internal LSL workflows are separate from my synthetic public demos; client changes require human review.</w:t>
       </w:r>
     </w:p>
     <w:bookmarkEnd w:id="35"/>

</xml_diff>